<commit_message>
[UPDATE] update report placeholder
</commit_message>
<xml_diff>
--- a/backend/transaction-service/src/main/resources/template/phieu-nhap-kho-theo-thong-tu-99.docx
+++ b/backend/transaction-service/src/main/resources/template/phieu-nhap-kho-theo-thong-tu-99.docx
@@ -8,21 +8,21 @@
         <w:rPr>
           <w:sz w:val="20"/>
           <w:szCs w:val="20"/>
-          <w:lang w:val="vi-VN"/>
+          <w:lang w:val="en-US"/>
         </w:rPr>
       </w:pPr>
     </w:p>
     <w:tbl>
       <w:tblPr>
         <w:tblStyle w:val="a"/>
-        <w:tblW w:w="8640" w:type="dxa"/>
+        <w:tblW w:w="9000" w:type="dxa"/>
         <w:tblInd w:w="0" w:type="dxa"/>
         <w:tblLayout w:type="fixed"/>
         <w:tblLook w:val="0000" w:firstRow="0" w:lastRow="0" w:firstColumn="0" w:lastColumn="0" w:noHBand="0" w:noVBand="0"/>
       </w:tblPr>
       <w:tblGrid>
         <w:gridCol w:w="3491"/>
-        <w:gridCol w:w="5149"/>
+        <w:gridCol w:w="5509"/>
       </w:tblGrid>
       <w:tr>
         <w:tc>
@@ -87,7 +87,7 @@
         </w:tc>
         <w:tc>
           <w:tcPr>
-            <w:tcW w:w="5149" w:type="dxa"/>
+            <w:tcW w:w="5509" w:type="dxa"/>
           </w:tcPr>
           <w:p>
             <w:pPr>
@@ -401,6 +401,12 @@
       <w:r>
         <w:rPr>
           <w:sz w:val="20"/>
+        </w:rPr>
+        <w:t>…………………</w:t>
+      </w:r>
+      <w:r>
+        <w:rPr>
+          <w:sz w:val="20"/>
           <w:szCs w:val="20"/>
         </w:rPr>
         <w:tab/>
@@ -510,20 +516,20 @@
     <w:tbl>
       <w:tblPr>
         <w:tblStyle w:val="a0"/>
-        <w:tblW w:w="8650" w:type="dxa"/>
+        <w:tblW w:w="9110" w:type="dxa"/>
         <w:tblInd w:w="-115" w:type="dxa"/>
         <w:tblLayout w:type="fixed"/>
         <w:tblLook w:val="0000" w:firstRow="0" w:lastRow="0" w:firstColumn="0" w:lastColumn="0" w:noHBand="0" w:noVBand="0"/>
       </w:tblPr>
       <w:tblGrid>
-        <w:gridCol w:w="815"/>
-        <w:gridCol w:w="2612"/>
-        <w:gridCol w:w="668"/>
-        <w:gridCol w:w="851"/>
-        <w:gridCol w:w="1012"/>
-        <w:gridCol w:w="836"/>
-        <w:gridCol w:w="799"/>
-        <w:gridCol w:w="1057"/>
+        <w:gridCol w:w="560"/>
+        <w:gridCol w:w="1710"/>
+        <w:gridCol w:w="810"/>
+        <w:gridCol w:w="900"/>
+        <w:gridCol w:w="1170"/>
+        <w:gridCol w:w="1170"/>
+        <w:gridCol w:w="1260"/>
+        <w:gridCol w:w="1530"/>
       </w:tblGrid>
       <w:tr>
         <w:trPr>
@@ -531,7 +537,7 @@
         </w:trPr>
         <w:tc>
           <w:tcPr>
-            <w:tcW w:w="815" w:type="dxa"/>
+            <w:tcW w:w="560" w:type="dxa"/>
             <w:vMerge w:val="restart"/>
             <w:tcBorders>
               <w:top w:val="single" w:sz="4" w:space="0" w:color="000000"/>
@@ -565,7 +571,7 @@
         </w:tc>
         <w:tc>
           <w:tcPr>
-            <w:tcW w:w="2612" w:type="dxa"/>
+            <w:tcW w:w="1710" w:type="dxa"/>
             <w:vMerge w:val="restart"/>
             <w:tcBorders>
               <w:top w:val="single" w:sz="4" w:space="0" w:color="000000"/>
@@ -599,7 +605,7 @@
         </w:tc>
         <w:tc>
           <w:tcPr>
-            <w:tcW w:w="668" w:type="dxa"/>
+            <w:tcW w:w="810" w:type="dxa"/>
             <w:vMerge w:val="restart"/>
             <w:tcBorders>
               <w:top w:val="single" w:sz="4" w:space="0" w:color="000000"/>
@@ -633,7 +639,7 @@
         </w:tc>
         <w:tc>
           <w:tcPr>
-            <w:tcW w:w="851" w:type="dxa"/>
+            <w:tcW w:w="900" w:type="dxa"/>
             <w:vMerge w:val="restart"/>
             <w:tcBorders>
               <w:top w:val="single" w:sz="4" w:space="0" w:color="000000"/>
@@ -667,7 +673,7 @@
         </w:tc>
         <w:tc>
           <w:tcPr>
-            <w:tcW w:w="1848" w:type="dxa"/>
+            <w:tcW w:w="2340" w:type="dxa"/>
             <w:gridSpan w:val="2"/>
             <w:tcBorders>
               <w:top w:val="single" w:sz="4" w:space="0" w:color="000000"/>
@@ -701,7 +707,7 @@
         </w:tc>
         <w:tc>
           <w:tcPr>
-            <w:tcW w:w="799" w:type="dxa"/>
+            <w:tcW w:w="1260" w:type="dxa"/>
             <w:tcBorders>
               <w:top w:val="single" w:sz="4" w:space="0" w:color="000000"/>
               <w:left w:val="single" w:sz="4" w:space="0" w:color="000000"/>
@@ -725,7 +731,7 @@
         </w:tc>
         <w:tc>
           <w:tcPr>
-            <w:tcW w:w="1057" w:type="dxa"/>
+            <w:tcW w:w="1530" w:type="dxa"/>
             <w:tcBorders>
               <w:top w:val="single" w:sz="4" w:space="0" w:color="000000"/>
               <w:left w:val="single" w:sz="4" w:space="0" w:color="000000"/>
@@ -754,7 +760,7 @@
         </w:trPr>
         <w:tc>
           <w:tcPr>
-            <w:tcW w:w="815" w:type="dxa"/>
+            <w:tcW w:w="560" w:type="dxa"/>
             <w:vMerge/>
             <w:tcBorders>
               <w:top w:val="single" w:sz="4" w:space="0" w:color="000000"/>
@@ -777,7 +783,7 @@
         </w:tc>
         <w:tc>
           <w:tcPr>
-            <w:tcW w:w="2612" w:type="dxa"/>
+            <w:tcW w:w="1710" w:type="dxa"/>
             <w:vMerge/>
             <w:tcBorders>
               <w:top w:val="single" w:sz="4" w:space="0" w:color="000000"/>
@@ -800,7 +806,7 @@
         </w:tc>
         <w:tc>
           <w:tcPr>
-            <w:tcW w:w="668" w:type="dxa"/>
+            <w:tcW w:w="810" w:type="dxa"/>
             <w:vMerge/>
             <w:tcBorders>
               <w:top w:val="single" w:sz="4" w:space="0" w:color="000000"/>
@@ -823,7 +829,7 @@
         </w:tc>
         <w:tc>
           <w:tcPr>
-            <w:tcW w:w="851" w:type="dxa"/>
+            <w:tcW w:w="900" w:type="dxa"/>
             <w:vMerge/>
             <w:tcBorders>
               <w:top w:val="single" w:sz="4" w:space="0" w:color="000000"/>
@@ -846,7 +852,7 @@
         </w:tc>
         <w:tc>
           <w:tcPr>
-            <w:tcW w:w="1012" w:type="dxa"/>
+            <w:tcW w:w="1170" w:type="dxa"/>
             <w:tcBorders>
               <w:top w:val="single" w:sz="4" w:space="0" w:color="000000"/>
               <w:left w:val="single" w:sz="4" w:space="0" w:color="000000"/>
@@ -879,7 +885,7 @@
         </w:tc>
         <w:tc>
           <w:tcPr>
-            <w:tcW w:w="836" w:type="dxa"/>
+            <w:tcW w:w="1170" w:type="dxa"/>
             <w:tcBorders>
               <w:top w:val="single" w:sz="4" w:space="0" w:color="000000"/>
               <w:left w:val="single" w:sz="4" w:space="0" w:color="000000"/>
@@ -912,7 +918,7 @@
         </w:tc>
         <w:tc>
           <w:tcPr>
-            <w:tcW w:w="799" w:type="dxa"/>
+            <w:tcW w:w="1260" w:type="dxa"/>
             <w:tcBorders>
               <w:top w:val="single" w:sz="4" w:space="0" w:color="000000"/>
               <w:left w:val="single" w:sz="4" w:space="0" w:color="000000"/>
@@ -945,7 +951,7 @@
         </w:tc>
         <w:tc>
           <w:tcPr>
-            <w:tcW w:w="1057" w:type="dxa"/>
+            <w:tcW w:w="1530" w:type="dxa"/>
             <w:tcBorders>
               <w:top w:val="single" w:sz="4" w:space="0" w:color="000000"/>
               <w:left w:val="single" w:sz="4" w:space="0" w:color="000000"/>
@@ -980,7 +986,7 @@
       <w:tr>
         <w:tc>
           <w:tcPr>
-            <w:tcW w:w="815" w:type="dxa"/>
+            <w:tcW w:w="560" w:type="dxa"/>
             <w:tcBorders>
               <w:top w:val="single" w:sz="4" w:space="0" w:color="000000"/>
               <w:left w:val="single" w:sz="4" w:space="0" w:color="000000"/>
@@ -1011,7 +1017,7 @@
         </w:tc>
         <w:tc>
           <w:tcPr>
-            <w:tcW w:w="2612" w:type="dxa"/>
+            <w:tcW w:w="1710" w:type="dxa"/>
             <w:tcBorders>
               <w:top w:val="single" w:sz="4" w:space="0" w:color="000000"/>
               <w:left w:val="single" w:sz="4" w:space="0" w:color="000000"/>
@@ -1042,7 +1048,7 @@
         </w:tc>
         <w:tc>
           <w:tcPr>
-            <w:tcW w:w="668" w:type="dxa"/>
+            <w:tcW w:w="810" w:type="dxa"/>
             <w:tcBorders>
               <w:top w:val="single" w:sz="4" w:space="0" w:color="000000"/>
               <w:left w:val="single" w:sz="4" w:space="0" w:color="000000"/>
@@ -1073,7 +1079,7 @@
         </w:tc>
         <w:tc>
           <w:tcPr>
-            <w:tcW w:w="851" w:type="dxa"/>
+            <w:tcW w:w="900" w:type="dxa"/>
             <w:tcBorders>
               <w:top w:val="single" w:sz="4" w:space="0" w:color="000000"/>
               <w:left w:val="single" w:sz="4" w:space="0" w:color="000000"/>
@@ -1104,7 +1110,7 @@
         </w:tc>
         <w:tc>
           <w:tcPr>
-            <w:tcW w:w="1012" w:type="dxa"/>
+            <w:tcW w:w="1170" w:type="dxa"/>
             <w:tcBorders>
               <w:top w:val="single" w:sz="4" w:space="0" w:color="000000"/>
               <w:left w:val="single" w:sz="4" w:space="0" w:color="000000"/>
@@ -1135,7 +1141,7 @@
         </w:tc>
         <w:tc>
           <w:tcPr>
-            <w:tcW w:w="836" w:type="dxa"/>
+            <w:tcW w:w="1170" w:type="dxa"/>
             <w:tcBorders>
               <w:top w:val="single" w:sz="4" w:space="0" w:color="000000"/>
               <w:left w:val="single" w:sz="4" w:space="0" w:color="000000"/>
@@ -1166,7 +1172,7 @@
         </w:tc>
         <w:tc>
           <w:tcPr>
-            <w:tcW w:w="799" w:type="dxa"/>
+            <w:tcW w:w="1260" w:type="dxa"/>
             <w:tcBorders>
               <w:top w:val="single" w:sz="4" w:space="0" w:color="000000"/>
               <w:left w:val="single" w:sz="4" w:space="0" w:color="000000"/>
@@ -1197,7 +1203,7 @@
         </w:tc>
         <w:tc>
           <w:tcPr>
-            <w:tcW w:w="1057" w:type="dxa"/>
+            <w:tcW w:w="1530" w:type="dxa"/>
             <w:tcBorders>
               <w:top w:val="single" w:sz="4" w:space="0" w:color="000000"/>
               <w:left w:val="single" w:sz="4" w:space="0" w:color="000000"/>
@@ -1230,7 +1236,7 @@
       <w:tr>
         <w:tc>
           <w:tcPr>
-            <w:tcW w:w="815" w:type="dxa"/>
+            <w:tcW w:w="560" w:type="dxa"/>
             <w:tcBorders>
               <w:top w:val="single" w:sz="4" w:space="0" w:color="000000"/>
               <w:left w:val="single" w:sz="4" w:space="0" w:color="000000"/>
@@ -1246,15 +1252,15 @@
               <w:spacing w:before="120" w:line="240" w:lineRule="auto"/>
               <w:jc w:val="center"/>
               <w:rPr>
-                <w:sz w:val="20"/>
-                <w:szCs w:val="20"/>
+                <w:sz w:val="18"/>
+                <w:szCs w:val="18"/>
                 <w:lang w:val="vi-VN"/>
               </w:rPr>
             </w:pPr>
             <w:r>
               <w:rPr>
-                <w:sz w:val="20"/>
-                <w:szCs w:val="20"/>
+                <w:sz w:val="18"/>
+                <w:szCs w:val="18"/>
                 <w:lang w:val="vi-VN"/>
               </w:rPr>
               <w:t>{{stt}}</w:t>
@@ -1263,7 +1269,7 @@
         </w:tc>
         <w:tc>
           <w:tcPr>
-            <w:tcW w:w="2612" w:type="dxa"/>
+            <w:tcW w:w="1710" w:type="dxa"/>
             <w:tcBorders>
               <w:top w:val="single" w:sz="4" w:space="0" w:color="000000"/>
               <w:left w:val="single" w:sz="4" w:space="0" w:color="000000"/>
@@ -1279,31 +1285,31 @@
               <w:spacing w:before="120" w:line="240" w:lineRule="auto"/>
               <w:jc w:val="center"/>
               <w:rPr>
-                <w:sz w:val="20"/>
-                <w:szCs w:val="20"/>
+                <w:sz w:val="18"/>
+                <w:szCs w:val="18"/>
                 <w:lang w:val="en-US"/>
               </w:rPr>
             </w:pPr>
             <w:r>
               <w:rPr>
-                <w:sz w:val="20"/>
-                <w:szCs w:val="20"/>
+                <w:sz w:val="18"/>
+                <w:szCs w:val="18"/>
                 <w:lang w:val="en-US"/>
               </w:rPr>
               <w:t>{{transaction.</w:t>
             </w:r>
             <w:r>
               <w:rPr>
-                <w:sz w:val="20"/>
-                <w:szCs w:val="20"/>
+                <w:sz w:val="18"/>
+                <w:szCs w:val="18"/>
                 <w:lang w:val="en-US"/>
               </w:rPr>
               <w:t>details</w:t>
             </w:r>
             <w:r>
               <w:rPr>
-                <w:sz w:val="20"/>
-                <w:szCs w:val="20"/>
+                <w:sz w:val="18"/>
+                <w:szCs w:val="18"/>
                 <w:lang w:val="en-US"/>
               </w:rPr>
               <w:t>.productName}}</w:t>
@@ -1312,7 +1318,7 @@
         </w:tc>
         <w:tc>
           <w:tcPr>
-            <w:tcW w:w="668" w:type="dxa"/>
+            <w:tcW w:w="810" w:type="dxa"/>
             <w:tcBorders>
               <w:top w:val="single" w:sz="4" w:space="0" w:color="000000"/>
               <w:left w:val="single" w:sz="4" w:space="0" w:color="000000"/>
@@ -1328,30 +1334,30 @@
               <w:spacing w:before="120" w:line="240" w:lineRule="auto"/>
               <w:jc w:val="center"/>
               <w:rPr>
-                <w:sz w:val="20"/>
-                <w:szCs w:val="20"/>
-              </w:rPr>
-            </w:pPr>
-            <w:r>
-              <w:rPr>
-                <w:sz w:val="20"/>
-                <w:szCs w:val="20"/>
+                <w:sz w:val="18"/>
+                <w:szCs w:val="18"/>
+              </w:rPr>
+            </w:pPr>
+            <w:r>
+              <w:rPr>
+                <w:sz w:val="18"/>
+                <w:szCs w:val="18"/>
                 <w:lang w:val="en-US"/>
               </w:rPr>
               <w:t>{{transaction.</w:t>
             </w:r>
             <w:r>
               <w:rPr>
-                <w:sz w:val="20"/>
-                <w:szCs w:val="20"/>
+                <w:sz w:val="18"/>
+                <w:szCs w:val="18"/>
                 <w:lang w:val="en-US"/>
               </w:rPr>
               <w:t>details</w:t>
             </w:r>
             <w:r>
               <w:rPr>
-                <w:sz w:val="20"/>
-                <w:szCs w:val="20"/>
+                <w:sz w:val="18"/>
+                <w:szCs w:val="18"/>
                 <w:lang w:val="en-US"/>
               </w:rPr>
               <w:t>.productCode}}</w:t>
@@ -1360,7 +1366,7 @@
         </w:tc>
         <w:tc>
           <w:tcPr>
-            <w:tcW w:w="851" w:type="dxa"/>
+            <w:tcW w:w="900" w:type="dxa"/>
             <w:tcBorders>
               <w:top w:val="single" w:sz="4" w:space="0" w:color="000000"/>
               <w:left w:val="single" w:sz="4" w:space="0" w:color="000000"/>
@@ -1376,30 +1382,30 @@
               <w:spacing w:before="120" w:line="240" w:lineRule="auto"/>
               <w:jc w:val="center"/>
               <w:rPr>
-                <w:sz w:val="20"/>
-                <w:szCs w:val="20"/>
-              </w:rPr>
-            </w:pPr>
-            <w:r>
-              <w:rPr>
-                <w:sz w:val="20"/>
-                <w:szCs w:val="20"/>
+                <w:sz w:val="18"/>
+                <w:szCs w:val="18"/>
+              </w:rPr>
+            </w:pPr>
+            <w:r>
+              <w:rPr>
+                <w:sz w:val="18"/>
+                <w:szCs w:val="18"/>
                 <w:lang w:val="en-US"/>
               </w:rPr>
               <w:t>{{transaction.</w:t>
             </w:r>
             <w:r>
               <w:rPr>
-                <w:sz w:val="20"/>
-                <w:szCs w:val="20"/>
+                <w:sz w:val="18"/>
+                <w:szCs w:val="18"/>
                 <w:lang w:val="en-US"/>
               </w:rPr>
               <w:t>details</w:t>
             </w:r>
             <w:r>
               <w:rPr>
-                <w:sz w:val="20"/>
-                <w:szCs w:val="20"/>
+                <w:sz w:val="18"/>
+                <w:szCs w:val="18"/>
                 <w:lang w:val="en-US"/>
               </w:rPr>
               <w:t>.unit}}</w:t>
@@ -1408,7 +1414,7 @@
         </w:tc>
         <w:tc>
           <w:tcPr>
-            <w:tcW w:w="1012" w:type="dxa"/>
+            <w:tcW w:w="1170" w:type="dxa"/>
             <w:tcBorders>
               <w:top w:val="single" w:sz="4" w:space="0" w:color="000000"/>
               <w:left w:val="single" w:sz="4" w:space="0" w:color="000000"/>
@@ -1424,30 +1430,30 @@
               <w:spacing w:before="120" w:line="240" w:lineRule="auto"/>
               <w:jc w:val="center"/>
               <w:rPr>
-                <w:sz w:val="20"/>
-                <w:szCs w:val="20"/>
-              </w:rPr>
-            </w:pPr>
-            <w:r>
-              <w:rPr>
-                <w:sz w:val="20"/>
-                <w:szCs w:val="20"/>
+                <w:sz w:val="18"/>
+                <w:szCs w:val="18"/>
+              </w:rPr>
+            </w:pPr>
+            <w:r>
+              <w:rPr>
+                <w:sz w:val="18"/>
+                <w:szCs w:val="18"/>
                 <w:lang w:val="en-US"/>
               </w:rPr>
               <w:t>{{transaction.</w:t>
             </w:r>
             <w:r>
               <w:rPr>
-                <w:sz w:val="20"/>
-                <w:szCs w:val="20"/>
+                <w:sz w:val="18"/>
+                <w:szCs w:val="18"/>
                 <w:lang w:val="en-US"/>
               </w:rPr>
               <w:t>details</w:t>
             </w:r>
             <w:r>
               <w:rPr>
-                <w:sz w:val="20"/>
-                <w:szCs w:val="20"/>
+                <w:sz w:val="18"/>
+                <w:szCs w:val="18"/>
                 <w:lang w:val="en-US"/>
               </w:rPr>
               <w:t>.plannedQuantity}}</w:t>
@@ -1456,7 +1462,7 @@
         </w:tc>
         <w:tc>
           <w:tcPr>
-            <w:tcW w:w="836" w:type="dxa"/>
+            <w:tcW w:w="1170" w:type="dxa"/>
             <w:tcBorders>
               <w:top w:val="single" w:sz="4" w:space="0" w:color="000000"/>
               <w:left w:val="single" w:sz="4" w:space="0" w:color="000000"/>
@@ -1472,46 +1478,46 @@
               <w:spacing w:before="120" w:line="240" w:lineRule="auto"/>
               <w:jc w:val="center"/>
               <w:rPr>
-                <w:sz w:val="20"/>
-                <w:szCs w:val="20"/>
-              </w:rPr>
-            </w:pPr>
-            <w:r>
-              <w:rPr>
-                <w:sz w:val="20"/>
-                <w:szCs w:val="20"/>
+                <w:sz w:val="18"/>
+                <w:szCs w:val="18"/>
+              </w:rPr>
+            </w:pPr>
+            <w:r>
+              <w:rPr>
+                <w:sz w:val="18"/>
+                <w:szCs w:val="18"/>
                 <w:lang w:val="en-US"/>
               </w:rPr>
               <w:t>{{transaction.</w:t>
             </w:r>
             <w:r>
               <w:rPr>
-                <w:sz w:val="20"/>
-                <w:szCs w:val="20"/>
+                <w:sz w:val="18"/>
+                <w:szCs w:val="18"/>
                 <w:lang w:val="en-US"/>
               </w:rPr>
               <w:t>details</w:t>
             </w:r>
             <w:r>
               <w:rPr>
-                <w:sz w:val="20"/>
-                <w:szCs w:val="20"/>
+                <w:sz w:val="18"/>
+                <w:szCs w:val="18"/>
                 <w:lang w:val="en-US"/>
               </w:rPr>
               <w:t>.</w:t>
             </w:r>
             <w:r>
               <w:rPr>
-                <w:sz w:val="20"/>
-                <w:szCs w:val="20"/>
+                <w:sz w:val="18"/>
+                <w:szCs w:val="18"/>
                 <w:lang w:val="en-US"/>
               </w:rPr>
               <w:t>actualQ</w:t>
             </w:r>
             <w:r>
               <w:rPr>
-                <w:sz w:val="20"/>
-                <w:szCs w:val="20"/>
+                <w:sz w:val="18"/>
+                <w:szCs w:val="18"/>
                 <w:lang w:val="en-US"/>
               </w:rPr>
               <w:t>uantity}}</w:t>
@@ -1520,7 +1526,7 @@
         </w:tc>
         <w:tc>
           <w:tcPr>
-            <w:tcW w:w="799" w:type="dxa"/>
+            <w:tcW w:w="1260" w:type="dxa"/>
             <w:tcBorders>
               <w:top w:val="single" w:sz="4" w:space="0" w:color="000000"/>
               <w:left w:val="single" w:sz="4" w:space="0" w:color="000000"/>
@@ -1536,30 +1542,30 @@
               <w:spacing w:before="120" w:line="240" w:lineRule="auto"/>
               <w:jc w:val="center"/>
               <w:rPr>
-                <w:sz w:val="20"/>
-                <w:szCs w:val="20"/>
-              </w:rPr>
-            </w:pPr>
-            <w:r>
-              <w:rPr>
-                <w:sz w:val="20"/>
-                <w:szCs w:val="20"/>
+                <w:sz w:val="18"/>
+                <w:szCs w:val="18"/>
+              </w:rPr>
+            </w:pPr>
+            <w:r>
+              <w:rPr>
+                <w:sz w:val="18"/>
+                <w:szCs w:val="18"/>
                 <w:lang w:val="en-US"/>
               </w:rPr>
               <w:t>{{transaction.</w:t>
             </w:r>
             <w:r>
               <w:rPr>
-                <w:sz w:val="20"/>
-                <w:szCs w:val="20"/>
+                <w:sz w:val="18"/>
+                <w:szCs w:val="18"/>
                 <w:lang w:val="en-US"/>
               </w:rPr>
               <w:t>details</w:t>
             </w:r>
             <w:r>
               <w:rPr>
-                <w:sz w:val="20"/>
-                <w:szCs w:val="20"/>
+                <w:sz w:val="18"/>
+                <w:szCs w:val="18"/>
                 <w:lang w:val="en-US"/>
               </w:rPr>
               <w:t>.price}}</w:t>
@@ -1568,7 +1574,7 @@
         </w:tc>
         <w:tc>
           <w:tcPr>
-            <w:tcW w:w="1057" w:type="dxa"/>
+            <w:tcW w:w="1530" w:type="dxa"/>
             <w:tcBorders>
               <w:top w:val="single" w:sz="4" w:space="0" w:color="000000"/>
               <w:left w:val="single" w:sz="4" w:space="0" w:color="000000"/>
@@ -1584,14 +1590,14 @@
               <w:spacing w:before="120" w:line="240" w:lineRule="auto"/>
               <w:jc w:val="center"/>
               <w:rPr>
-                <w:sz w:val="20"/>
-                <w:szCs w:val="20"/>
-              </w:rPr>
-            </w:pPr>
-            <w:r>
-              <w:rPr>
-                <w:sz w:val="20"/>
-                <w:szCs w:val="20"/>
+                <w:sz w:val="18"/>
+                <w:szCs w:val="18"/>
+              </w:rPr>
+            </w:pPr>
+            <w:r>
+              <w:rPr>
+                <w:sz w:val="18"/>
+                <w:szCs w:val="18"/>
                 <w:lang w:val="en-US"/>
               </w:rPr>
               <w:t>{{transaction.details.totalPrice}}</w:t>
@@ -1602,395 +1608,7 @@
       <w:tr>
         <w:tc>
           <w:tcPr>
-            <w:tcW w:w="815" w:type="dxa"/>
-            <w:tcBorders>
-              <w:top w:val="single" w:sz="4" w:space="0" w:color="000000"/>
-              <w:left w:val="single" w:sz="4" w:space="0" w:color="000000"/>
-              <w:bottom w:val="nil"/>
-              <w:right w:val="nil"/>
-            </w:tcBorders>
-            <w:shd w:val="clear" w:color="auto" w:fill="FFFFFF"/>
-            <w:vAlign w:val="center"/>
-          </w:tcPr>
-          <w:p>
-            <w:pPr>
-              <w:widowControl w:val="0"/>
-              <w:spacing w:before="120" w:line="240" w:lineRule="auto"/>
-              <w:jc w:val="center"/>
-              <w:rPr>
-                <w:sz w:val="20"/>
-                <w:szCs w:val="20"/>
-              </w:rPr>
-            </w:pPr>
-          </w:p>
-        </w:tc>
-        <w:tc>
-          <w:tcPr>
-            <w:tcW w:w="2612" w:type="dxa"/>
-            <w:tcBorders>
-              <w:top w:val="single" w:sz="4" w:space="0" w:color="000000"/>
-              <w:left w:val="single" w:sz="4" w:space="0" w:color="000000"/>
-              <w:bottom w:val="nil"/>
-              <w:right w:val="nil"/>
-            </w:tcBorders>
-            <w:shd w:val="clear" w:color="auto" w:fill="FFFFFF"/>
-            <w:vAlign w:val="center"/>
-          </w:tcPr>
-          <w:p>
-            <w:pPr>
-              <w:widowControl w:val="0"/>
-              <w:spacing w:before="120" w:line="240" w:lineRule="auto"/>
-              <w:jc w:val="center"/>
-              <w:rPr>
-                <w:sz w:val="20"/>
-                <w:szCs w:val="20"/>
-              </w:rPr>
-            </w:pPr>
-          </w:p>
-        </w:tc>
-        <w:tc>
-          <w:tcPr>
-            <w:tcW w:w="668" w:type="dxa"/>
-            <w:tcBorders>
-              <w:top w:val="single" w:sz="4" w:space="0" w:color="000000"/>
-              <w:left w:val="single" w:sz="4" w:space="0" w:color="000000"/>
-              <w:bottom w:val="nil"/>
-              <w:right w:val="nil"/>
-            </w:tcBorders>
-            <w:shd w:val="clear" w:color="auto" w:fill="FFFFFF"/>
-            <w:vAlign w:val="center"/>
-          </w:tcPr>
-          <w:p>
-            <w:pPr>
-              <w:widowControl w:val="0"/>
-              <w:spacing w:before="120" w:line="240" w:lineRule="auto"/>
-              <w:jc w:val="center"/>
-              <w:rPr>
-                <w:sz w:val="20"/>
-                <w:szCs w:val="20"/>
-              </w:rPr>
-            </w:pPr>
-          </w:p>
-        </w:tc>
-        <w:tc>
-          <w:tcPr>
-            <w:tcW w:w="851" w:type="dxa"/>
-            <w:tcBorders>
-              <w:top w:val="single" w:sz="4" w:space="0" w:color="000000"/>
-              <w:left w:val="single" w:sz="4" w:space="0" w:color="000000"/>
-              <w:bottom w:val="nil"/>
-              <w:right w:val="nil"/>
-            </w:tcBorders>
-            <w:shd w:val="clear" w:color="auto" w:fill="FFFFFF"/>
-            <w:vAlign w:val="center"/>
-          </w:tcPr>
-          <w:p>
-            <w:pPr>
-              <w:widowControl w:val="0"/>
-              <w:spacing w:before="120" w:line="240" w:lineRule="auto"/>
-              <w:jc w:val="center"/>
-              <w:rPr>
-                <w:sz w:val="20"/>
-                <w:szCs w:val="20"/>
-              </w:rPr>
-            </w:pPr>
-          </w:p>
-        </w:tc>
-        <w:tc>
-          <w:tcPr>
-            <w:tcW w:w="1012" w:type="dxa"/>
-            <w:tcBorders>
-              <w:top w:val="single" w:sz="4" w:space="0" w:color="000000"/>
-              <w:left w:val="single" w:sz="4" w:space="0" w:color="000000"/>
-              <w:bottom w:val="nil"/>
-              <w:right w:val="nil"/>
-            </w:tcBorders>
-            <w:shd w:val="clear" w:color="auto" w:fill="FFFFFF"/>
-            <w:vAlign w:val="center"/>
-          </w:tcPr>
-          <w:p>
-            <w:pPr>
-              <w:widowControl w:val="0"/>
-              <w:spacing w:before="120" w:line="240" w:lineRule="auto"/>
-              <w:jc w:val="center"/>
-              <w:rPr>
-                <w:sz w:val="20"/>
-                <w:szCs w:val="20"/>
-              </w:rPr>
-            </w:pPr>
-          </w:p>
-        </w:tc>
-        <w:tc>
-          <w:tcPr>
-            <w:tcW w:w="836" w:type="dxa"/>
-            <w:tcBorders>
-              <w:top w:val="single" w:sz="4" w:space="0" w:color="000000"/>
-              <w:left w:val="single" w:sz="4" w:space="0" w:color="000000"/>
-              <w:bottom w:val="nil"/>
-              <w:right w:val="nil"/>
-            </w:tcBorders>
-            <w:shd w:val="clear" w:color="auto" w:fill="FFFFFF"/>
-            <w:vAlign w:val="center"/>
-          </w:tcPr>
-          <w:p>
-            <w:pPr>
-              <w:widowControl w:val="0"/>
-              <w:spacing w:before="120" w:line="240" w:lineRule="auto"/>
-              <w:jc w:val="center"/>
-              <w:rPr>
-                <w:sz w:val="20"/>
-                <w:szCs w:val="20"/>
-              </w:rPr>
-            </w:pPr>
-          </w:p>
-        </w:tc>
-        <w:tc>
-          <w:tcPr>
-            <w:tcW w:w="799" w:type="dxa"/>
-            <w:tcBorders>
-              <w:top w:val="single" w:sz="4" w:space="0" w:color="000000"/>
-              <w:left w:val="single" w:sz="4" w:space="0" w:color="000000"/>
-              <w:bottom w:val="nil"/>
-              <w:right w:val="nil"/>
-            </w:tcBorders>
-            <w:shd w:val="clear" w:color="auto" w:fill="FFFFFF"/>
-            <w:vAlign w:val="center"/>
-          </w:tcPr>
-          <w:p>
-            <w:pPr>
-              <w:widowControl w:val="0"/>
-              <w:spacing w:before="120" w:line="240" w:lineRule="auto"/>
-              <w:jc w:val="center"/>
-              <w:rPr>
-                <w:sz w:val="20"/>
-                <w:szCs w:val="20"/>
-              </w:rPr>
-            </w:pPr>
-          </w:p>
-        </w:tc>
-        <w:tc>
-          <w:tcPr>
-            <w:tcW w:w="1057" w:type="dxa"/>
-            <w:tcBorders>
-              <w:top w:val="single" w:sz="4" w:space="0" w:color="000000"/>
-              <w:left w:val="single" w:sz="4" w:space="0" w:color="000000"/>
-              <w:bottom w:val="nil"/>
-              <w:right w:val="single" w:sz="4" w:space="0" w:color="000000"/>
-            </w:tcBorders>
-            <w:shd w:val="clear" w:color="auto" w:fill="FFFFFF"/>
-            <w:vAlign w:val="center"/>
-          </w:tcPr>
-          <w:p>
-            <w:pPr>
-              <w:widowControl w:val="0"/>
-              <w:spacing w:before="120" w:line="240" w:lineRule="auto"/>
-              <w:jc w:val="center"/>
-              <w:rPr>
-                <w:sz w:val="20"/>
-                <w:szCs w:val="20"/>
-              </w:rPr>
-            </w:pPr>
-          </w:p>
-        </w:tc>
-      </w:tr>
-      <w:tr>
-        <w:tc>
-          <w:tcPr>
-            <w:tcW w:w="815" w:type="dxa"/>
-            <w:tcBorders>
-              <w:top w:val="single" w:sz="4" w:space="0" w:color="000000"/>
-              <w:left w:val="single" w:sz="4" w:space="0" w:color="000000"/>
-              <w:bottom w:val="nil"/>
-              <w:right w:val="nil"/>
-            </w:tcBorders>
-            <w:shd w:val="clear" w:color="auto" w:fill="FFFFFF"/>
-            <w:vAlign w:val="center"/>
-          </w:tcPr>
-          <w:p>
-            <w:pPr>
-              <w:widowControl w:val="0"/>
-              <w:spacing w:before="120" w:line="240" w:lineRule="auto"/>
-              <w:jc w:val="center"/>
-              <w:rPr>
-                <w:sz w:val="20"/>
-                <w:szCs w:val="20"/>
-              </w:rPr>
-            </w:pPr>
-          </w:p>
-        </w:tc>
-        <w:tc>
-          <w:tcPr>
-            <w:tcW w:w="2612" w:type="dxa"/>
-            <w:tcBorders>
-              <w:top w:val="single" w:sz="4" w:space="0" w:color="000000"/>
-              <w:left w:val="single" w:sz="4" w:space="0" w:color="000000"/>
-              <w:bottom w:val="nil"/>
-              <w:right w:val="nil"/>
-            </w:tcBorders>
-            <w:shd w:val="clear" w:color="auto" w:fill="FFFFFF"/>
-            <w:vAlign w:val="center"/>
-          </w:tcPr>
-          <w:p>
-            <w:pPr>
-              <w:widowControl w:val="0"/>
-              <w:spacing w:before="120" w:line="240" w:lineRule="auto"/>
-              <w:jc w:val="center"/>
-              <w:rPr>
-                <w:sz w:val="20"/>
-                <w:szCs w:val="20"/>
-              </w:rPr>
-            </w:pPr>
-          </w:p>
-        </w:tc>
-        <w:tc>
-          <w:tcPr>
-            <w:tcW w:w="668" w:type="dxa"/>
-            <w:tcBorders>
-              <w:top w:val="single" w:sz="4" w:space="0" w:color="000000"/>
-              <w:left w:val="single" w:sz="4" w:space="0" w:color="000000"/>
-              <w:bottom w:val="nil"/>
-              <w:right w:val="nil"/>
-            </w:tcBorders>
-            <w:shd w:val="clear" w:color="auto" w:fill="FFFFFF"/>
-            <w:vAlign w:val="center"/>
-          </w:tcPr>
-          <w:p>
-            <w:pPr>
-              <w:widowControl w:val="0"/>
-              <w:spacing w:before="120" w:line="240" w:lineRule="auto"/>
-              <w:jc w:val="center"/>
-              <w:rPr>
-                <w:sz w:val="20"/>
-                <w:szCs w:val="20"/>
-              </w:rPr>
-            </w:pPr>
-          </w:p>
-        </w:tc>
-        <w:tc>
-          <w:tcPr>
-            <w:tcW w:w="851" w:type="dxa"/>
-            <w:tcBorders>
-              <w:top w:val="single" w:sz="4" w:space="0" w:color="000000"/>
-              <w:left w:val="single" w:sz="4" w:space="0" w:color="000000"/>
-              <w:bottom w:val="nil"/>
-              <w:right w:val="nil"/>
-            </w:tcBorders>
-            <w:shd w:val="clear" w:color="auto" w:fill="FFFFFF"/>
-            <w:vAlign w:val="center"/>
-          </w:tcPr>
-          <w:p>
-            <w:pPr>
-              <w:widowControl w:val="0"/>
-              <w:spacing w:before="120" w:line="240" w:lineRule="auto"/>
-              <w:jc w:val="center"/>
-              <w:rPr>
-                <w:sz w:val="20"/>
-                <w:szCs w:val="20"/>
-              </w:rPr>
-            </w:pPr>
-          </w:p>
-        </w:tc>
-        <w:tc>
-          <w:tcPr>
-            <w:tcW w:w="1012" w:type="dxa"/>
-            <w:tcBorders>
-              <w:top w:val="single" w:sz="4" w:space="0" w:color="000000"/>
-              <w:left w:val="single" w:sz="4" w:space="0" w:color="000000"/>
-              <w:bottom w:val="nil"/>
-              <w:right w:val="nil"/>
-            </w:tcBorders>
-            <w:shd w:val="clear" w:color="auto" w:fill="FFFFFF"/>
-            <w:vAlign w:val="center"/>
-          </w:tcPr>
-          <w:p>
-            <w:pPr>
-              <w:widowControl w:val="0"/>
-              <w:spacing w:before="120" w:line="240" w:lineRule="auto"/>
-              <w:jc w:val="center"/>
-              <w:rPr>
-                <w:sz w:val="20"/>
-                <w:szCs w:val="20"/>
-              </w:rPr>
-            </w:pPr>
-          </w:p>
-        </w:tc>
-        <w:tc>
-          <w:tcPr>
-            <w:tcW w:w="836" w:type="dxa"/>
-            <w:tcBorders>
-              <w:top w:val="single" w:sz="4" w:space="0" w:color="000000"/>
-              <w:left w:val="single" w:sz="4" w:space="0" w:color="000000"/>
-              <w:bottom w:val="nil"/>
-              <w:right w:val="nil"/>
-            </w:tcBorders>
-            <w:shd w:val="clear" w:color="auto" w:fill="FFFFFF"/>
-            <w:vAlign w:val="center"/>
-          </w:tcPr>
-          <w:p>
-            <w:pPr>
-              <w:widowControl w:val="0"/>
-              <w:spacing w:before="120" w:line="240" w:lineRule="auto"/>
-              <w:jc w:val="center"/>
-              <w:rPr>
-                <w:sz w:val="20"/>
-                <w:szCs w:val="20"/>
-              </w:rPr>
-            </w:pPr>
-          </w:p>
-        </w:tc>
-        <w:tc>
-          <w:tcPr>
-            <w:tcW w:w="799" w:type="dxa"/>
-            <w:tcBorders>
-              <w:top w:val="single" w:sz="4" w:space="0" w:color="000000"/>
-              <w:left w:val="single" w:sz="4" w:space="0" w:color="000000"/>
-              <w:bottom w:val="nil"/>
-              <w:right w:val="nil"/>
-            </w:tcBorders>
-            <w:shd w:val="clear" w:color="auto" w:fill="FFFFFF"/>
-            <w:vAlign w:val="center"/>
-          </w:tcPr>
-          <w:p>
-            <w:pPr>
-              <w:widowControl w:val="0"/>
-              <w:spacing w:before="120" w:line="240" w:lineRule="auto"/>
-              <w:jc w:val="center"/>
-              <w:rPr>
-                <w:sz w:val="20"/>
-                <w:szCs w:val="20"/>
-              </w:rPr>
-            </w:pPr>
-          </w:p>
-        </w:tc>
-        <w:tc>
-          <w:tcPr>
-            <w:tcW w:w="1057" w:type="dxa"/>
-            <w:tcBorders>
-              <w:top w:val="single" w:sz="4" w:space="0" w:color="000000"/>
-              <w:left w:val="single" w:sz="4" w:space="0" w:color="000000"/>
-              <w:bottom w:val="nil"/>
-              <w:right w:val="single" w:sz="4" w:space="0" w:color="000000"/>
-            </w:tcBorders>
-            <w:shd w:val="clear" w:color="auto" w:fill="FFFFFF"/>
-            <w:vAlign w:val="center"/>
-          </w:tcPr>
-          <w:p>
-            <w:pPr>
-              <w:widowControl w:val="0"/>
-              <w:spacing w:before="120" w:line="240" w:lineRule="auto"/>
-              <w:jc w:val="center"/>
-              <w:rPr>
-                <w:sz w:val="20"/>
-                <w:szCs w:val="20"/>
-              </w:rPr>
-            </w:pPr>
-          </w:p>
-        </w:tc>
-      </w:tr>
-      <w:tr>
-        <w:tc>
-          <w:tcPr>
-            <w:tcW w:w="815" w:type="dxa"/>
+            <w:tcW w:w="560" w:type="dxa"/>
             <w:tcBorders>
               <w:top w:val="single" w:sz="4" w:space="0" w:color="000000"/>
               <w:left w:val="single" w:sz="4" w:space="0" w:color="000000"/>
@@ -2014,7 +1632,7 @@
         </w:tc>
         <w:tc>
           <w:tcPr>
-            <w:tcW w:w="2612" w:type="dxa"/>
+            <w:tcW w:w="1710" w:type="dxa"/>
             <w:tcBorders>
               <w:top w:val="single" w:sz="4" w:space="0" w:color="000000"/>
               <w:left w:val="single" w:sz="4" w:space="0" w:color="000000"/>
@@ -2047,7 +1665,7 @@
         </w:tc>
         <w:tc>
           <w:tcPr>
-            <w:tcW w:w="668" w:type="dxa"/>
+            <w:tcW w:w="810" w:type="dxa"/>
             <w:tcBorders>
               <w:top w:val="single" w:sz="4" w:space="0" w:color="000000"/>
               <w:left w:val="single" w:sz="4" w:space="0" w:color="000000"/>
@@ -2080,7 +1698,7 @@
         </w:tc>
         <w:tc>
           <w:tcPr>
-            <w:tcW w:w="851" w:type="dxa"/>
+            <w:tcW w:w="900" w:type="dxa"/>
             <w:tcBorders>
               <w:top w:val="single" w:sz="4" w:space="0" w:color="000000"/>
               <w:left w:val="single" w:sz="4" w:space="0" w:color="000000"/>
@@ -2113,7 +1731,7 @@
         </w:tc>
         <w:tc>
           <w:tcPr>
-            <w:tcW w:w="1012" w:type="dxa"/>
+            <w:tcW w:w="1170" w:type="dxa"/>
             <w:tcBorders>
               <w:top w:val="single" w:sz="4" w:space="0" w:color="000000"/>
               <w:left w:val="single" w:sz="4" w:space="0" w:color="000000"/>
@@ -2146,7 +1764,7 @@
         </w:tc>
         <w:tc>
           <w:tcPr>
-            <w:tcW w:w="836" w:type="dxa"/>
+            <w:tcW w:w="1170" w:type="dxa"/>
             <w:tcBorders>
               <w:top w:val="single" w:sz="4" w:space="0" w:color="000000"/>
               <w:left w:val="single" w:sz="4" w:space="0" w:color="000000"/>
@@ -2179,7 +1797,7 @@
         </w:tc>
         <w:tc>
           <w:tcPr>
-            <w:tcW w:w="799" w:type="dxa"/>
+            <w:tcW w:w="1260" w:type="dxa"/>
             <w:tcBorders>
               <w:top w:val="single" w:sz="4" w:space="0" w:color="000000"/>
               <w:left w:val="single" w:sz="4" w:space="0" w:color="000000"/>
@@ -2212,7 +1830,7 @@
         </w:tc>
         <w:tc>
           <w:tcPr>
-            <w:tcW w:w="1057" w:type="dxa"/>
+            <w:tcW w:w="1530" w:type="dxa"/>
             <w:tcBorders>
               <w:top w:val="single" w:sz="4" w:space="0" w:color="000000"/>
               <w:left w:val="single" w:sz="4" w:space="0" w:color="000000"/>
@@ -2228,6 +1846,8 @@
               <w:spacing w:before="120" w:line="240" w:lineRule="auto"/>
               <w:jc w:val="center"/>
               <w:rPr>
+                <w:b/>
+                <w:bCs/>
                 <w:sz w:val="20"/>
                 <w:szCs w:val="20"/>
                 <w:lang w:val="en-US"/>
@@ -2235,8 +1855,10 @@
             </w:pPr>
             <w:r>
               <w:rPr>
-                <w:sz w:val="20"/>
-                <w:szCs w:val="20"/>
+                <w:b/>
+                <w:bCs/>
+                <w:sz w:val="18"/>
+                <w:szCs w:val="18"/>
                 <w:lang w:val="en-US"/>
               </w:rPr>
               <w:t>{{grandTotal}}</w:t>
@@ -2266,6 +1888,10 @@
       </w:r>
       <w:r>
         <w:rPr>
+          <w:b/>
+          <w:bCs/>
+          <w:i/>
+          <w:iCs/>
           <w:sz w:val="20"/>
           <w:szCs w:val="20"/>
         </w:rPr>
@@ -2301,6 +1927,12 @@
       <w:r>
         <w:rPr>
           <w:sz w:val="20"/>
+        </w:rPr>
+        <w:t>……………………………….</w:t>
+      </w:r>
+      <w:r>
+        <w:rPr>
+          <w:sz w:val="20"/>
           <w:szCs w:val="20"/>
         </w:rPr>
         <w:tab/>
@@ -2322,21 +1954,21 @@
     <w:tbl>
       <w:tblPr>
         <w:tblStyle w:val="a1"/>
-        <w:tblW w:w="8856" w:type="dxa"/>
+        <w:tblW w:w="9108" w:type="dxa"/>
         <w:tblInd w:w="-108" w:type="dxa"/>
         <w:tblLayout w:type="fixed"/>
         <w:tblLook w:val="0000" w:firstRow="0" w:lastRow="0" w:firstColumn="0" w:lastColumn="0" w:noHBand="0" w:noVBand="0"/>
       </w:tblPr>
       <w:tblGrid>
-        <w:gridCol w:w="2214"/>
-        <w:gridCol w:w="2214"/>
-        <w:gridCol w:w="2214"/>
-        <w:gridCol w:w="2214"/>
+        <w:gridCol w:w="1818"/>
+        <w:gridCol w:w="2250"/>
+        <w:gridCol w:w="1800"/>
+        <w:gridCol w:w="3240"/>
       </w:tblGrid>
       <w:tr>
         <w:tc>
           <w:tcPr>
-            <w:tcW w:w="2214" w:type="dxa"/>
+            <w:tcW w:w="1818" w:type="dxa"/>
           </w:tcPr>
           <w:p>
             <w:pPr>
@@ -2380,7 +2012,7 @@
         </w:tc>
         <w:tc>
           <w:tcPr>
-            <w:tcW w:w="2214" w:type="dxa"/>
+            <w:tcW w:w="2250" w:type="dxa"/>
           </w:tcPr>
           <w:p>
             <w:pPr>
@@ -2424,7 +2056,7 @@
         </w:tc>
         <w:tc>
           <w:tcPr>
-            <w:tcW w:w="2214" w:type="dxa"/>
+            <w:tcW w:w="1800" w:type="dxa"/>
           </w:tcPr>
           <w:p>
             <w:pPr>
@@ -2468,75 +2100,18 @@
         </w:tc>
         <w:tc>
           <w:tcPr>
-            <w:tcW w:w="2214" w:type="dxa"/>
-          </w:tcPr>
-          <w:p>
-            <w:pPr>
-              <w:widowControl w:val="0"/>
-              <w:spacing w:before="120" w:line="240" w:lineRule="auto"/>
-              <w:jc w:val="center"/>
-              <w:rPr>
-                <w:sz w:val="20"/>
-                <w:szCs w:val="20"/>
-              </w:rPr>
-            </w:pPr>
-            <w:r>
-              <w:rPr>
-                <w:i/>
-                <w:iCs/>
-                <w:sz w:val="20"/>
-                <w:szCs w:val="20"/>
-              </w:rPr>
-              <w:t>Ngày</w:t>
-            </w:r>
-            <w:r>
-              <w:rPr>
-                <w:i/>
-                <w:iCs/>
-                <w:sz w:val="20"/>
-                <w:szCs w:val="20"/>
-                <w:lang w:val="vi-VN"/>
-              </w:rPr>
-              <w:t xml:space="preserve"> {{day}}</w:t>
-            </w:r>
-            <w:r>
-              <w:rPr>
-                <w:i/>
-                <w:iCs/>
-                <w:sz w:val="20"/>
-                <w:szCs w:val="20"/>
-              </w:rPr>
-              <w:t xml:space="preserve"> tháng</w:t>
-            </w:r>
-            <w:r>
-              <w:rPr>
-                <w:i/>
-                <w:iCs/>
-                <w:sz w:val="20"/>
-                <w:szCs w:val="20"/>
-                <w:lang w:val="vi-VN"/>
-              </w:rPr>
-              <w:t xml:space="preserve"> {{month}}</w:t>
-            </w:r>
-            <w:r>
-              <w:rPr>
-                <w:i/>
-                <w:iCs/>
-                <w:sz w:val="20"/>
-                <w:szCs w:val="20"/>
-              </w:rPr>
-              <w:t xml:space="preserve"> năm</w:t>
-            </w:r>
-            <w:r>
-              <w:rPr>
-                <w:i/>
-                <w:iCs/>
-                <w:sz w:val="20"/>
-                <w:szCs w:val="20"/>
-                <w:lang w:val="vi-VN"/>
-              </w:rPr>
-              <w:t xml:space="preserve"> {{year}}</w:t>
-            </w:r>
+            <w:tcW w:w="3240" w:type="dxa"/>
+          </w:tcPr>
+          <w:p>
+            <w:pPr>
+              <w:widowControl w:val="0"/>
+              <w:spacing w:before="120" w:line="240" w:lineRule="auto"/>
+              <w:jc w:val="center"/>
+              <w:rPr>
+                <w:sz w:val="20"/>
+                <w:szCs w:val="20"/>
+              </w:rPr>
+            </w:pPr>
             <w:r>
               <w:rPr>
                 <w:i/>

</xml_diff>